<commit_message>
docs: add Section 5.4 in-depth architectural comparison (CRNN vs Tesseract trade-offs) to final academic report
</commit_message>
<xml_diff>
--- a/results/Az_OCR_Akademik_Hesabat_Final.docx
+++ b/results/Az_OCR_Akademik_Hesabat_Final.docx
@@ -6416,6 +6416,29 @@
           <w:sz w:val="19"/>
         </w:rPr>
         <w:t>Müşahidə: V2 modeli həm Serif (Times New Roman), həm də Sans-Serif (Calibri) sənədlərində Azərbaycan dilinin xüsusi diakritik simvollarını (`ə, ı, ö, ğ, ü, ş, ç`) yüksək dəqiqliklə tanımışdır. Xüsusilə Tesseract 5-in Foto 1-də yol verdiyi 'rəngə' -&gt; 'Təngə' (r-&gt;T əvəzetməsi), 'təbii' -&gt; 'təbi' (hərf itkisi) və 'xüsusi' -&gt; 'XÜSuSsi' kimi qrafik xətalarını V2 modeli sıfır xəta ilə (0.00% CER) oxumuşdur. V1 modeli isə hər iki sənəddə kəskin simvol təhriflərinə yol verərək fotorealistik mühitdə işləmə qabiliyyətinin olmadığını nümayiş etdirmişdir.</w:t>
+      </w:r>
+    </w:p>
+    <w:p>
+      <w:r>
+        <w:rPr>
+          <w:b/>
+          <w:sz w:val="22"/>
+        </w:rPr>
+        <w:t>5.4. Arxitektura və Mühəndislik Fərqləri: Niyə CRNN Sözdə, Tesseract isə Bütöv Sətirdə Üstündür? (Design Trade-offs)</w:t>
+      </w:r>
+    </w:p>
+    <w:p>
+      <w:r>
+        <w:rPr>
+          <w:sz w:val="20"/>
+        </w:rPr>
+        <w:t>Real sınaq nəticələri iki mühüm mühəndislik faktını və model fəlsəfəsini üzə çıxarır:</w:t>
+        <w:br/>
+        <w:t>1. Diakritik Həssaslıq və Milli Dilə Özəlləşmə (CRNN Üstünlüyü): Google Tesseract 5 qlobal və çoxdilli nəhəng bir mühərrikdir (30 illik HP/Google inkişaf tarixi). Lakin onun rəsmi Azərbaycan paketi (`aze.traineddata`) spesifik diakritik simvollar üçün xüsusi dərindən optimallaşdırılmadığı üçün real kamera kəsimlərində 'rəngə' -&gt; 'Təngə' (r-&gt;T), 'təbii' -&gt; 'təbi' (hərf itkisi) və 'xüsusi' -&gt; 'XÜSuSsi' kimi qrafem xətalarına yol verir. Bizim layihələndirdiyimiz milli CRNN arxitekturası isə sırf Azərbaycan əlifbası (32 hərf) və onun unikal qrafemləri (`ə, ı, ö, ğ, ü, ş, ç`, böyük `İ/I`) üzrə hədəfləndiyindən, real sənəd sözlərində Tesseract-dan 3 dəfə daha az xəta (Word CER: 0.66% vs 1.97%) göstərmişdir.</w:t>
+        <w:br/>
+        <w:t>2. Sətir Sıxılması və Ölçü Məhdudiyyəti (Tesseract Üstünlüyü): Bütöv, uzun sətirlərdə Tesseract-ın irəlidə olmasının səbəbi arxitektur fərqdir. Bizim CRNN modelimiz təlim zamanı sabit 32x512 piksel giriş ölçüsü qəbul edir. 12 Meqapiksellik kameradan kəsilmiş 2200 piksellik bütöv bir cümlə (80+ simvol) 512 pikselə sıxıldıqda, hər bir simvol cəmi 4–5 piksel eninə daralır və bu daralma BiLSTM-in zaman addımlarını (T=128) həddən artıq yükləyir. Tesseract isə daxili xətt seqmentatoru və dinamik pəncərə (sliding-window LSTM) istifadə etdiyi üçün bütöv sətirlərdə sıxılma problemi yaşamır.</w:t>
+        <w:br/>
+        <w:t>3. Yüngüllük, Mobil Çeviklik və Sənaye Tövsiyəsi: Tesseract nəhəng, onlarla asılılığı olan ağır bir C++ mühərrikidir. Bizim CRNN şəbəkəmiz isə cəmi 2.5 milyon parametrdən (~8 MB çəki) ibarət kompakt end-to-end modeldir və mobil/edge cihazlarda millisanisiyələrlə işləyir. Buna görə də sənaye tətbiqləri üçün ən optimal arxitektura: Sənəd daxilində sözləri tapan yüngül bir Mətn Detektoru (Text Detector / Bounding Box Segmenter) və aşkar edilmiş sözləri 0.66% yüksək dəqiqliklə oxuyan milli CRNN tanıma mühərrikimizin (Recognition Engine) hibrid inteqrasiyasıdır.</w:t>
       </w:r>
     </w:p>
     <w:p>

</xml_diff>